<commit_message>
added logo on all pages as the middle header
</commit_message>
<xml_diff>
--- a/GROUP 1 PROJECT.docx
+++ b/GROUP 1 PROJECT.docx
@@ -1236,25 +1236,7 @@
           <w:sz w:val="24"/>
           <w:szCs w:val="24"/>
         </w:rPr>
-        <w:t xml:space="preserve">, internship management is currently carried out using manual methods. Interns are registered manually, attendance is </w:t>
-      </w:r>
-      <w:proofErr w:type="gramStart"/>
-      <w:r>
-        <w:rPr>
-          <w:rFonts w:ascii="Times New Roman" w:eastAsia="Times New Roman" w:hAnsi="Times New Roman" w:cs="Times New Roman"/>
-          <w:sz w:val="24"/>
-          <w:szCs w:val="24"/>
-        </w:rPr>
-        <w:t>recorded</w:t>
-      </w:r>
-      <w:proofErr w:type="gramEnd"/>
-      <w:r>
-        <w:rPr>
-          <w:rFonts w:ascii="Times New Roman" w:eastAsia="Times New Roman" w:hAnsi="Times New Roman" w:cs="Times New Roman"/>
-          <w:sz w:val="24"/>
-          <w:szCs w:val="24"/>
-        </w:rPr>
-        <w:t xml:space="preserve"> in paper attendance books, and supervisor assignments are communicated verbally. These processes are time-consuming, susceptible to human error, and make it difficult to efficiently store, retrieve, and monitor internship records. They also limit the organization's ability to accurately track attendance and evaluate intern performance.</w:t>
+        <w:t>, internship management is currently carried out using manual methods. Interns are registered manually, attendance is recorded in paper attendance books, and supervisor assignments are communicated verbally. These processes are time-consuming, susceptible to human error, and make it difficult to efficiently store, retrieve, and monitor internship records. They also limit the organization's ability to accurately track attendance and evaluate intern performance.</w:t>
       </w:r>
     </w:p>
     <w:p>
@@ -2922,8 +2904,6 @@
         </w:rPr>
       </w:pPr>
       <w:bookmarkStart w:id="12" w:name="_Toc236216665"/>
-      <w:bookmarkStart w:id="13" w:name="_GoBack"/>
-      <w:bookmarkEnd w:id="13"/>
       <w:r>
         <w:rPr>
           <w:rStyle w:val="Heading3Char"/>
@@ -3010,7 +2990,7 @@
           <w:szCs w:val="24"/>
         </w:rPr>
       </w:pPr>
-      <w:bookmarkStart w:id="14" w:name="_Toc236216666"/>
+      <w:bookmarkStart w:id="13" w:name="_Toc236216666"/>
       <w:proofErr w:type="spellStart"/>
       <w:r>
         <w:rPr>
@@ -3019,7 +2999,7 @@
         </w:rPr>
         <w:t>IndexedDB</w:t>
       </w:r>
-      <w:bookmarkEnd w:id="14"/>
+      <w:bookmarkEnd w:id="13"/>
       <w:proofErr w:type="spellEnd"/>
       <w:r>
         <w:rPr>
@@ -3078,7 +3058,7 @@
           <w:sz w:val="24"/>
         </w:rPr>
       </w:pPr>
-      <w:bookmarkStart w:id="15" w:name="_Toc236216667"/>
+      <w:bookmarkStart w:id="14" w:name="_Toc236216667"/>
       <w:r>
         <w:rPr>
           <w:sz w:val="24"/>
@@ -3091,7 +3071,7 @@
         </w:rPr>
         <w:t>:</w:t>
       </w:r>
-      <w:bookmarkEnd w:id="15"/>
+      <w:bookmarkEnd w:id="14"/>
     </w:p>
     <w:p>
       <w:pPr>
@@ -3181,11 +3161,11 @@
         <w:pStyle w:val="Heading1"/>
         <w:spacing w:line="360" w:lineRule="auto"/>
       </w:pPr>
-      <w:bookmarkStart w:id="16" w:name="_Toc236216668"/>
+      <w:bookmarkStart w:id="15" w:name="_Toc236216668"/>
       <w:r>
         <w:t>Appendices</w:t>
       </w:r>
-      <w:bookmarkEnd w:id="16"/>
+      <w:bookmarkEnd w:id="15"/>
     </w:p>
     <w:p>
       <w:pPr>
@@ -3265,11 +3245,11 @@
       <w:r>
         <w:t xml:space="preserve"> </w:t>
       </w:r>
-      <w:bookmarkStart w:id="17" w:name="_Toc236216669"/>
+      <w:bookmarkStart w:id="16" w:name="_Toc236216669"/>
       <w:r>
         <w:t>Fig 1:</w:t>
       </w:r>
-      <w:bookmarkEnd w:id="17"/>
+      <w:bookmarkEnd w:id="16"/>
       <w:r>
         <w:t xml:space="preserve"> </w:t>
       </w:r>
@@ -3346,11 +3326,11 @@
       <w:pPr>
         <w:pStyle w:val="Heading2"/>
       </w:pPr>
-      <w:bookmarkStart w:id="18" w:name="_Toc236216670"/>
+      <w:bookmarkStart w:id="17" w:name="_Toc236216670"/>
       <w:r>
         <w:t>Fig 2:</w:t>
       </w:r>
-      <w:bookmarkEnd w:id="18"/>
+      <w:bookmarkEnd w:id="17"/>
       <w:r>
         <w:t xml:space="preserve"> </w:t>
       </w:r>
@@ -3464,11 +3444,11 @@
       <w:pPr>
         <w:pStyle w:val="Heading2"/>
       </w:pPr>
-      <w:bookmarkStart w:id="19" w:name="_Toc236216671"/>
+      <w:bookmarkStart w:id="18" w:name="_Toc236216671"/>
       <w:r>
         <w:t>Fig 3:</w:t>
       </w:r>
-      <w:bookmarkEnd w:id="19"/>
+      <w:bookmarkEnd w:id="18"/>
     </w:p>
     <w:p>
       <w:pPr>
@@ -3565,11 +3545,11 @@
       <w:pPr>
         <w:pStyle w:val="Heading2"/>
       </w:pPr>
-      <w:bookmarkStart w:id="20" w:name="_Toc236216672"/>
+      <w:bookmarkStart w:id="19" w:name="_Toc236216672"/>
       <w:r>
         <w:t>Fig 4:</w:t>
       </w:r>
-      <w:bookmarkEnd w:id="20"/>
+      <w:bookmarkEnd w:id="19"/>
       <w:r>
         <w:t xml:space="preserve"> </w:t>
       </w:r>
@@ -3636,11 +3616,11 @@
       <w:pPr>
         <w:pStyle w:val="Heading2"/>
       </w:pPr>
-      <w:bookmarkStart w:id="21" w:name="_Toc236216673"/>
+      <w:bookmarkStart w:id="20" w:name="_Toc236216673"/>
       <w:r>
         <w:t>Fig 5:</w:t>
       </w:r>
-      <w:bookmarkEnd w:id="21"/>
+      <w:bookmarkEnd w:id="20"/>
       <w:r>
         <w:t xml:space="preserve"> </w:t>
       </w:r>
@@ -3711,11 +3691,11 @@
       <w:pPr>
         <w:pStyle w:val="Heading2"/>
       </w:pPr>
-      <w:bookmarkStart w:id="22" w:name="_Toc236216674"/>
+      <w:bookmarkStart w:id="21" w:name="_Toc236216674"/>
       <w:r>
         <w:t>Fig 6:</w:t>
       </w:r>
-      <w:bookmarkEnd w:id="22"/>
+      <w:bookmarkEnd w:id="21"/>
       <w:r>
         <w:t xml:space="preserve"> </w:t>
       </w:r>
@@ -3788,50 +3768,50 @@
       <w:pPr>
         <w:pStyle w:val="Heading2"/>
       </w:pPr>
-      <w:bookmarkStart w:id="23" w:name="_Toc236216675"/>
+      <w:bookmarkStart w:id="22" w:name="_Toc236216675"/>
       <w:r>
         <w:t>Fig 7:</w:t>
       </w:r>
+      <w:bookmarkEnd w:id="22"/>
+      <w:r>
+        <w:t xml:space="preserve"> </w:t>
+      </w:r>
+    </w:p>
+    <w:p>
+      <w:pPr>
+        <w:rPr>
+          <w:rFonts w:ascii="Times New Roman" w:hAnsi="Times New Roman" w:cs="Times New Roman"/>
+        </w:rPr>
+      </w:pPr>
+      <w:r>
+        <w:t xml:space="preserve"> </w:t>
+      </w:r>
+      <w:r>
+        <w:rPr>
+          <w:rFonts w:ascii="Times New Roman" w:hAnsi="Times New Roman" w:cs="Times New Roman"/>
+        </w:rPr>
+        <w:t xml:space="preserve">Jira </w:t>
+      </w:r>
+      <w:r>
+        <w:rPr>
+          <w:rFonts w:ascii="Times New Roman" w:hAnsi="Times New Roman" w:cs="Times New Roman"/>
+        </w:rPr>
+        <w:t>platform</w:t>
+      </w:r>
+      <w:r>
+        <w:rPr>
+          <w:rFonts w:ascii="Times New Roman" w:hAnsi="Times New Roman" w:cs="Times New Roman"/>
+        </w:rPr>
+        <w:t xml:space="preserve">  </w:t>
+      </w:r>
+      <w:bookmarkStart w:id="23" w:name="_GoBack"/>
       <w:bookmarkEnd w:id="23"/>
       <w:r>
-        <w:t xml:space="preserve"> </w:t>
-      </w:r>
-    </w:p>
-    <w:p>
-      <w:pPr>
-        <w:rPr>
-          <w:rFonts w:ascii="Times New Roman" w:hAnsi="Times New Roman" w:cs="Times New Roman"/>
-        </w:rPr>
-      </w:pPr>
-      <w:r>
-        <w:t xml:space="preserve"> </w:t>
-      </w:r>
-      <w:r>
-        <w:rPr>
-          <w:rFonts w:ascii="Times New Roman" w:hAnsi="Times New Roman" w:cs="Times New Roman"/>
-        </w:rPr>
-        <w:t xml:space="preserve">Jira </w:t>
-      </w:r>
-      <w:proofErr w:type="gramStart"/>
-      <w:r>
-        <w:rPr>
-          <w:rFonts w:ascii="Times New Roman" w:hAnsi="Times New Roman" w:cs="Times New Roman"/>
-        </w:rPr>
-        <w:t>platform</w:t>
-      </w:r>
-      <w:r>
-        <w:rPr>
-          <w:rFonts w:ascii="Times New Roman" w:hAnsi="Times New Roman" w:cs="Times New Roman"/>
-        </w:rPr>
-        <w:t xml:space="preserve"> </w:t>
-      </w:r>
-      <w:r>
-        <w:rPr>
-          <w:rFonts w:ascii="Times New Roman" w:hAnsi="Times New Roman" w:cs="Times New Roman"/>
-        </w:rPr>
-        <w:t xml:space="preserve"> is</w:t>
-      </w:r>
-      <w:proofErr w:type="gramEnd"/>
+        <w:rPr>
+          <w:rFonts w:ascii="Times New Roman" w:hAnsi="Times New Roman" w:cs="Times New Roman"/>
+        </w:rPr>
+        <w:t>is</w:t>
+      </w:r>
       <w:r>
         <w:rPr>
           <w:rFonts w:ascii="Times New Roman" w:hAnsi="Times New Roman" w:cs="Times New Roman"/>
@@ -3895,7 +3875,51 @@
         <w:rPr>
           <w:rFonts w:ascii="Times New Roman" w:hAnsi="Times New Roman" w:cs="Times New Roman"/>
         </w:rPr>
-        <w:t xml:space="preserve"> offers fast performance, zero hosting costs, and complete data privacy, since all data stays on the user's device. Administrators can register interns, generate credentials, and process attendance records quickly and reliably, even without an internet connection. This project proves that powerful, secure, and scalable internship management tools can be built directly into the browser, opening the door for future upgrades like offline tracking, performance evaluation, and better team collaboration.</w:t>
+        <w:t xml:space="preserve"> offers fast performance, zero hosting costs, and complete data privacy, since all data stays on the user's device. Administrators can register interns, generate credentials, and process attendance records quickly and reliably, even without an internet connection. This project proves that powerful, secure, and scalable internship management tools can be built directly into the browser, opening the door for future upgrades like offline tracking, performance evaluation, </w:t>
+      </w:r>
+      <w:proofErr w:type="gramStart"/>
+      <w:r>
+        <w:rPr>
+          <w:rFonts w:ascii="Times New Roman" w:hAnsi="Times New Roman" w:cs="Times New Roman"/>
+        </w:rPr>
+        <w:t>and</w:t>
+      </w:r>
+      <w:r>
+        <w:rPr>
+          <w:rFonts w:ascii="Times New Roman" w:hAnsi="Times New Roman" w:cs="Times New Roman"/>
+        </w:rPr>
+        <w:t xml:space="preserve"> </w:t>
+      </w:r>
+      <w:r>
+        <w:rPr>
+          <w:rFonts w:ascii="Times New Roman" w:hAnsi="Times New Roman" w:cs="Times New Roman"/>
+        </w:rPr>
+        <w:t xml:space="preserve"> better</w:t>
+      </w:r>
+      <w:proofErr w:type="gramEnd"/>
+      <w:r>
+        <w:rPr>
+          <w:rFonts w:ascii="Times New Roman" w:hAnsi="Times New Roman" w:cs="Times New Roman"/>
+        </w:rPr>
+        <w:t xml:space="preserve"> </w:t>
+      </w:r>
+      <w:r>
+        <w:rPr>
+          <w:rFonts w:ascii="Times New Roman" w:hAnsi="Times New Roman" w:cs="Times New Roman"/>
+        </w:rPr>
+        <w:t xml:space="preserve">team </w:t>
+      </w:r>
+      <w:r>
+        <w:rPr>
+          <w:rFonts w:ascii="Times New Roman" w:hAnsi="Times New Roman" w:cs="Times New Roman"/>
+        </w:rPr>
+        <w:t xml:space="preserve"> </w:t>
+      </w:r>
+      <w:r>
+        <w:rPr>
+          <w:rFonts w:ascii="Times New Roman" w:hAnsi="Times New Roman" w:cs="Times New Roman"/>
+        </w:rPr>
+        <w:t>collaboration.</w:t>
       </w:r>
     </w:p>
     <w:p>
@@ -8218,7 +8242,7 @@
 </file>
 
 <file path=customXml/itemProps1.xml><?xml version="1.0" encoding="utf-8"?>
-<ds:datastoreItem xmlns:ds="http://schemas.openxmlformats.org/officeDocument/2006/customXml" ds:itemID="{A8F1CCCD-25F1-4DC2-B623-F39F092F3725}">
+<ds:datastoreItem xmlns:ds="http://schemas.openxmlformats.org/officeDocument/2006/customXml" ds:itemID="{C7D6C170-CBD2-4767-9095-C22B25F8F923}">
   <ds:schemaRefs>
     <ds:schemaRef ds:uri="http://schemas.openxmlformats.org/officeDocument/2006/bibliography"/>
   </ds:schemaRefs>

</xml_diff>

<commit_message>
added edit and update button
</commit_message>
<xml_diff>
--- a/GROUP 1 PROJECT.docx
+++ b/GROUP 1 PROJECT.docx
@@ -3166,15 +3166,19 @@
         <w:t>Appendices</w:t>
       </w:r>
       <w:bookmarkEnd w:id="15"/>
+      <w:r>
+        <w:t>:</w:t>
+      </w:r>
     </w:p>
     <w:p>
       <w:pPr>
         <w:spacing w:line="360" w:lineRule="auto"/>
-        <w:ind w:firstLine="360"/>
-        <w:rPr>
-          <w:rFonts w:ascii="Times New Roman" w:hAnsi="Times New Roman" w:cs="Times New Roman"/>
-        </w:rPr>
-      </w:pPr>
+        <w:rPr>
+          <w:rFonts w:ascii="Times New Roman" w:hAnsi="Times New Roman" w:cs="Times New Roman"/>
+        </w:rPr>
+      </w:pPr>
+      <w:bookmarkStart w:id="16" w:name="_GoBack"/>
+      <w:bookmarkEnd w:id="16"/>
       <w:r>
         <w:rPr>
           <w:rFonts w:ascii="Times New Roman" w:hAnsi="Times New Roman" w:cs="Times New Roman"/>
@@ -3197,15 +3201,12 @@
         <w:spacing w:line="360" w:lineRule="auto"/>
       </w:pPr>
       <w:r>
-        <w:rPr>
-          <w:noProof/>
-        </w:rPr>
         <w:lastRenderedPageBreak/>
         <w:drawing>
-          <wp:inline distT="0" distB="0" distL="0" distR="0" wp14:anchorId="7E2C7061" wp14:editId="7E75324E">
-            <wp:extent cx="8665029" cy="4108483"/>
-            <wp:effectExtent l="0" t="0" r="3175" b="6350"/>
-            <wp:docPr id="9" name="Picture 9"/>
+          <wp:inline distT="0" distB="0" distL="0" distR="0" wp14:anchorId="7E09FF6C" wp14:editId="5FDF7AAD">
+            <wp:extent cx="8620066" cy="4066903"/>
+            <wp:effectExtent l="0" t="0" r="0" b="0"/>
+            <wp:docPr id="8" name="Picture 8"/>
             <wp:cNvGraphicFramePr>
               <a:graphicFrameLocks xmlns:a="http://schemas.openxmlformats.org/drawingml/2006/main" noChangeAspect="1"/>
             </wp:cNvGraphicFramePr>
@@ -3225,7 +3226,7 @@
                   <pic:spPr>
                     <a:xfrm>
                       <a:off x="0" y="0"/>
-                      <a:ext cx="8665029" cy="4108483"/>
+                      <a:ext cx="8620066" cy="4066903"/>
                     </a:xfrm>
                     <a:prstGeom prst="rect">
                       <a:avLst/>
@@ -3245,11 +3246,11 @@
       <w:r>
         <w:t xml:space="preserve"> </w:t>
       </w:r>
-      <w:bookmarkStart w:id="16" w:name="_Toc236216669"/>
+      <w:bookmarkStart w:id="17" w:name="_Toc236216669"/>
       <w:r>
         <w:t>Fig 1:</w:t>
       </w:r>
-      <w:bookmarkEnd w:id="16"/>
+      <w:bookmarkEnd w:id="17"/>
       <w:r>
         <w:t xml:space="preserve"> </w:t>
       </w:r>
@@ -3282,14 +3283,11 @@
     </w:p>
     <w:p>
       <w:r>
-        <w:rPr>
-          <w:noProof/>
-        </w:rPr>
         <w:drawing>
-          <wp:inline distT="0" distB="0" distL="0" distR="0" wp14:anchorId="0ECCF724" wp14:editId="5E08D82A">
-            <wp:extent cx="8610600" cy="4093715"/>
-            <wp:effectExtent l="0" t="0" r="0" b="2540"/>
-            <wp:docPr id="17" name="Picture 17"/>
+          <wp:inline distT="0" distB="0" distL="0" distR="0" wp14:anchorId="2E6AC9A0" wp14:editId="2ACE73AF">
+            <wp:extent cx="8933289" cy="4212771"/>
+            <wp:effectExtent l="0" t="0" r="1270" b="0"/>
+            <wp:docPr id="1" name="Picture 1"/>
             <wp:cNvGraphicFramePr>
               <a:graphicFrameLocks xmlns:a="http://schemas.openxmlformats.org/drawingml/2006/main" noChangeAspect="1"/>
             </wp:cNvGraphicFramePr>
@@ -3309,7 +3307,7 @@
                   <pic:spPr>
                     <a:xfrm>
                       <a:off x="0" y="0"/>
-                      <a:ext cx="8610600" cy="4093715"/>
+                      <a:ext cx="8950091" cy="4220695"/>
                     </a:xfrm>
                     <a:prstGeom prst="rect">
                       <a:avLst/>
@@ -3326,11 +3324,11 @@
       <w:pPr>
         <w:pStyle w:val="Heading2"/>
       </w:pPr>
-      <w:bookmarkStart w:id="17" w:name="_Toc236216670"/>
+      <w:bookmarkStart w:id="18" w:name="_Toc236216670"/>
       <w:r>
         <w:t>Fig 2:</w:t>
       </w:r>
-      <w:bookmarkEnd w:id="17"/>
+      <w:bookmarkEnd w:id="18"/>
       <w:r>
         <w:t xml:space="preserve"> </w:t>
       </w:r>
@@ -3396,18 +3394,18 @@
           <w:sz w:val="24"/>
         </w:rPr>
       </w:pPr>
-    </w:p>
-    <w:p>
-      <w:r>
-        <w:rPr>
-          <w:noProof/>
+      <w:r>
+        <w:rPr>
+          <w:rFonts w:ascii="Arial" w:hAnsi="Arial" w:cs="Arial"/>
+          <w:b/>
+          <w:sz w:val="24"/>
         </w:rPr>
         <w:lastRenderedPageBreak/>
         <w:drawing>
-          <wp:inline distT="0" distB="0" distL="0" distR="0" wp14:anchorId="248676DC" wp14:editId="558AAB6A">
-            <wp:extent cx="8926286" cy="4190396"/>
-            <wp:effectExtent l="0" t="0" r="8255" b="635"/>
-            <wp:docPr id="1" name="Picture 1"/>
+          <wp:inline distT="0" distB="0" distL="0" distR="0" wp14:anchorId="4404D37A" wp14:editId="0831CDE2">
+            <wp:extent cx="8979539" cy="4267200"/>
+            <wp:effectExtent l="0" t="0" r="0" b="0"/>
+            <wp:docPr id="22" name="Picture 22"/>
             <wp:cNvGraphicFramePr>
               <a:graphicFrameLocks xmlns:a="http://schemas.openxmlformats.org/drawingml/2006/main" noChangeAspect="1"/>
             </wp:cNvGraphicFramePr>
@@ -3427,7 +3425,7 @@
                   <pic:spPr>
                     <a:xfrm>
                       <a:off x="0" y="0"/>
-                      <a:ext cx="8937327" cy="4195579"/>
+                      <a:ext cx="8995718" cy="4274889"/>
                     </a:xfrm>
                     <a:prstGeom prst="rect">
                       <a:avLst/>
@@ -3444,11 +3442,11 @@
       <w:pPr>
         <w:pStyle w:val="Heading2"/>
       </w:pPr>
-      <w:bookmarkStart w:id="18" w:name="_Toc236216671"/>
+      <w:bookmarkStart w:id="19" w:name="_Toc236216671"/>
       <w:r>
         <w:t>Fig 3:</w:t>
       </w:r>
-      <w:bookmarkEnd w:id="18"/>
+      <w:bookmarkEnd w:id="19"/>
     </w:p>
     <w:p>
       <w:pPr>
@@ -3502,13 +3500,15 @@
       </w:pPr>
       <w:r>
         <w:rPr>
-          <w:noProof/>
+          <w:rFonts w:ascii="Times New Roman" w:hAnsi="Times New Roman" w:cs="Times New Roman"/>
+          <w:sz w:val="24"/>
+          <w:szCs w:val="24"/>
         </w:rPr>
         <w:drawing>
-          <wp:inline distT="0" distB="0" distL="0" distR="0" wp14:anchorId="6CF35C13" wp14:editId="4F2030CC">
-            <wp:extent cx="8863965" cy="4212085"/>
-            <wp:effectExtent l="0" t="0" r="0" b="0"/>
-            <wp:docPr id="4" name="Picture 4"/>
+          <wp:inline distT="0" distB="0" distL="0" distR="0" wp14:anchorId="03693CAD" wp14:editId="58740AD0">
+            <wp:extent cx="8926286" cy="4241893"/>
+            <wp:effectExtent l="0" t="0" r="8255" b="6350"/>
+            <wp:docPr id="21" name="Picture 21"/>
             <wp:cNvGraphicFramePr>
               <a:graphicFrameLocks xmlns:a="http://schemas.openxmlformats.org/drawingml/2006/main" noChangeAspect="1"/>
             </wp:cNvGraphicFramePr>
@@ -3528,7 +3528,7 @@
                   <pic:spPr>
                     <a:xfrm>
                       <a:off x="0" y="0"/>
-                      <a:ext cx="8863965" cy="4212085"/>
+                      <a:ext cx="8942369" cy="4249536"/>
                     </a:xfrm>
                     <a:prstGeom prst="rect">
                       <a:avLst/>
@@ -3545,11 +3545,11 @@
       <w:pPr>
         <w:pStyle w:val="Heading2"/>
       </w:pPr>
-      <w:bookmarkStart w:id="19" w:name="_Toc236216672"/>
+      <w:bookmarkStart w:id="20" w:name="_Toc236216672"/>
       <w:r>
         <w:t>Fig 4:</w:t>
       </w:r>
-      <w:bookmarkEnd w:id="19"/>
+      <w:bookmarkEnd w:id="20"/>
       <w:r>
         <w:t xml:space="preserve"> </w:t>
       </w:r>
@@ -3570,15 +3570,12 @@
     <w:p/>
     <w:p>
       <w:r>
-        <w:rPr>
-          <w:noProof/>
-        </w:rPr>
         <w:lastRenderedPageBreak/>
         <w:drawing>
-          <wp:inline distT="0" distB="0" distL="0" distR="0" wp14:anchorId="79CDA0BC" wp14:editId="677778F0">
-            <wp:extent cx="8860971" cy="4238308"/>
+          <wp:inline distT="0" distB="0" distL="0" distR="0" wp14:anchorId="74958D5F" wp14:editId="20DF08D1">
+            <wp:extent cx="8902591" cy="4256314"/>
             <wp:effectExtent l="0" t="0" r="0" b="0"/>
-            <wp:docPr id="20" name="Picture 20"/>
+            <wp:docPr id="14" name="Picture 14"/>
             <wp:cNvGraphicFramePr>
               <a:graphicFrameLocks xmlns:a="http://schemas.openxmlformats.org/drawingml/2006/main" noChangeAspect="1"/>
             </wp:cNvGraphicFramePr>
@@ -3598,7 +3595,7 @@
                   <pic:spPr>
                     <a:xfrm>
                       <a:off x="0" y="0"/>
-                      <a:ext cx="8866345" cy="4240878"/>
+                      <a:ext cx="8904014" cy="4256994"/>
                     </a:xfrm>
                     <a:prstGeom prst="rect">
                       <a:avLst/>
@@ -3616,11 +3613,11 @@
       <w:pPr>
         <w:pStyle w:val="Heading2"/>
       </w:pPr>
-      <w:bookmarkStart w:id="20" w:name="_Toc236216673"/>
+      <w:bookmarkStart w:id="21" w:name="_Toc236216673"/>
       <w:r>
         <w:t>Fig 5:</w:t>
       </w:r>
-      <w:bookmarkEnd w:id="20"/>
+      <w:bookmarkEnd w:id="21"/>
       <w:r>
         <w:t xml:space="preserve"> </w:t>
       </w:r>
@@ -3641,20 +3638,13 @@
     </w:p>
     <w:p/>
     <w:p/>
-    <w:p/>
-    <w:p/>
-    <w:p/>
-    <w:p/>
-    <w:p>
-      <w:r>
-        <w:rPr>
-          <w:noProof/>
-        </w:rPr>
+    <w:p>
+      <w:r>
         <w:drawing>
-          <wp:inline distT="0" distB="0" distL="0" distR="0" wp14:anchorId="349D34B2" wp14:editId="01061FE4">
-            <wp:extent cx="8926286" cy="4223773"/>
-            <wp:effectExtent l="0" t="0" r="8255" b="5715"/>
-            <wp:docPr id="5" name="Picture 5"/>
+          <wp:inline distT="0" distB="0" distL="0" distR="0" wp14:anchorId="327EF8C3" wp14:editId="4315AE33">
+            <wp:extent cx="8982254" cy="4278086"/>
+            <wp:effectExtent l="0" t="0" r="0" b="8255"/>
+            <wp:docPr id="19" name="Picture 19"/>
             <wp:cNvGraphicFramePr>
               <a:graphicFrameLocks xmlns:a="http://schemas.openxmlformats.org/drawingml/2006/main" noChangeAspect="1"/>
             </wp:cNvGraphicFramePr>
@@ -3674,7 +3664,7 @@
                   <pic:spPr>
                     <a:xfrm>
                       <a:off x="0" y="0"/>
-                      <a:ext cx="8942357" cy="4231378"/>
+                      <a:ext cx="8983980" cy="4278908"/>
                     </a:xfrm>
                     <a:prstGeom prst="rect">
                       <a:avLst/>
@@ -3691,11 +3681,11 @@
       <w:pPr>
         <w:pStyle w:val="Heading2"/>
       </w:pPr>
-      <w:bookmarkStart w:id="21" w:name="_Toc236216674"/>
+      <w:bookmarkStart w:id="22" w:name="_Toc236216674"/>
       <w:r>
         <w:t>Fig 6:</w:t>
       </w:r>
-      <w:bookmarkEnd w:id="21"/>
+      <w:bookmarkEnd w:id="22"/>
       <w:r>
         <w:t xml:space="preserve"> </w:t>
       </w:r>
@@ -3714,19 +3704,12 @@
       </w:r>
     </w:p>
     <w:p/>
-    <w:p/>
-    <w:p>
-      <w:pPr>
-        <w:pStyle w:val="NormalWeb"/>
-      </w:pPr>
-    </w:p>
-    <w:p/>
-    <w:p/>
     <w:p>
       <w:r>
         <w:rPr>
           <w:noProof/>
         </w:rPr>
+        <w:lastRenderedPageBreak/>
         <w:drawing>
           <wp:inline distT="0" distB="0" distL="0" distR="0" wp14:anchorId="6D38A46C" wp14:editId="3108C277">
             <wp:extent cx="8924342" cy="4752975"/>
@@ -3768,11 +3751,11 @@
       <w:pPr>
         <w:pStyle w:val="Heading2"/>
       </w:pPr>
-      <w:bookmarkStart w:id="22" w:name="_Toc236216675"/>
+      <w:bookmarkStart w:id="23" w:name="_Toc236216675"/>
       <w:r>
         <w:t>Fig 7:</w:t>
       </w:r>
-      <w:bookmarkEnd w:id="22"/>
+      <w:bookmarkEnd w:id="23"/>
       <w:r>
         <w:t xml:space="preserve"> </w:t>
       </w:r>
@@ -3804,8 +3787,6 @@
         </w:rPr>
         <w:t xml:space="preserve">  </w:t>
       </w:r>
-      <w:bookmarkStart w:id="23" w:name="_GoBack"/>
-      <w:bookmarkEnd w:id="23"/>
       <w:r>
         <w:rPr>
           <w:rFonts w:ascii="Times New Roman" w:hAnsi="Times New Roman" w:cs="Times New Roman"/>
@@ -8242,7 +8223,7 @@
 </file>
 
 <file path=customXml/itemProps1.xml><?xml version="1.0" encoding="utf-8"?>
-<ds:datastoreItem xmlns:ds="http://schemas.openxmlformats.org/officeDocument/2006/customXml" ds:itemID="{C7D6C170-CBD2-4767-9095-C22B25F8F923}">
+<ds:datastoreItem xmlns:ds="http://schemas.openxmlformats.org/officeDocument/2006/customXml" ds:itemID="{F5F79CC8-B88E-43B8-B8D0-C07BBC005253}">
   <ds:schemaRefs>
     <ds:schemaRef ds:uri="http://schemas.openxmlformats.org/officeDocument/2006/bibliography"/>
   </ds:schemaRefs>

</xml_diff>

<commit_message>
Add performance type each performance should have a small piece of percentage And see history of performance At date to attendance Added checking in button to take your time And same for check out automatically Not modifiable
</commit_message>
<xml_diff>
--- a/GROUP 1 PROJECT.docx
+++ b/GROUP 1 PROJECT.docx
@@ -453,15 +453,13 @@
           <w:szCs w:val="24"/>
         </w:rPr>
       </w:pPr>
+      <w:bookmarkStart w:id="0" w:name="_GoBack"/>
+      <w:bookmarkEnd w:id="0"/>
     </w:p>
     <w:p>
       <w:pPr>
         <w:spacing w:after="0"/>
       </w:pPr>
-      <w:r>
-        <w:lastRenderedPageBreak/>
-        <w:br w:type="page"/>
-      </w:r>
     </w:p>
     <w:p>
       <w:pPr>
@@ -480,7 +478,6 @@
           <w:sz w:val="40"/>
           <w:szCs w:val="40"/>
         </w:rPr>
-        <w:lastRenderedPageBreak/>
         <w:t>Table of Contents</w:t>
       </w:r>
     </w:p>
@@ -1193,7 +1190,7 @@
           <w:rFonts w:ascii="Times New Roman" w:hAnsi="Times New Roman" w:cs="Times New Roman"/>
         </w:rPr>
       </w:pPr>
-      <w:bookmarkStart w:id="0" w:name="_Toc236216653"/>
+      <w:bookmarkStart w:id="1" w:name="_Toc236216653"/>
       <w:r>
         <w:rPr>
           <w:rFonts w:ascii="Times New Roman" w:hAnsi="Times New Roman" w:cs="Times New Roman"/>
@@ -1201,7 +1198,7 @@
         <w:lastRenderedPageBreak/>
         <w:t>Introduction</w:t>
       </w:r>
-      <w:bookmarkEnd w:id="0"/>
+      <w:bookmarkEnd w:id="1"/>
     </w:p>
     <w:p>
       <w:pPr>
@@ -1315,14 +1312,14 @@
           <w:rFonts w:ascii="Times New Roman" w:hAnsi="Times New Roman" w:cs="Times New Roman"/>
         </w:rPr>
       </w:pPr>
-      <w:bookmarkStart w:id="1" w:name="_Toc236216654"/>
+      <w:bookmarkStart w:id="2" w:name="_Toc236216654"/>
       <w:r>
         <w:rPr>
           <w:rFonts w:ascii="Times New Roman" w:hAnsi="Times New Roman" w:cs="Times New Roman"/>
         </w:rPr>
         <w:t>Tools</w:t>
       </w:r>
-      <w:bookmarkEnd w:id="1"/>
+      <w:bookmarkEnd w:id="2"/>
     </w:p>
     <w:p>
       <w:pPr>
@@ -1402,12 +1399,20 @@
     <w:p>
       <w:pPr>
         <w:pStyle w:val="Heading3"/>
-        <w:rPr>
-          <w:rFonts w:ascii="Times New Roman" w:hAnsi="Times New Roman" w:cs="Times New Roman"/>
-          <w:sz w:val="24"/>
-        </w:rPr>
-      </w:pPr>
-      <w:bookmarkStart w:id="2" w:name="_Toc236216655"/>
+        <w:ind w:firstLine="720"/>
+        <w:rPr>
+          <w:rFonts w:ascii="Times New Roman" w:hAnsi="Times New Roman" w:cs="Times New Roman"/>
+          <w:sz w:val="24"/>
+        </w:rPr>
+      </w:pPr>
+      <w:bookmarkStart w:id="3" w:name="_Toc236216655"/>
+      <w:r>
+        <w:rPr>
+          <w:rFonts w:ascii="Times New Roman" w:hAnsi="Times New Roman" w:cs="Times New Roman"/>
+          <w:sz w:val="24"/>
+        </w:rPr>
+        <w:t xml:space="preserve">1.1 </w:t>
+      </w:r>
       <w:r>
         <w:rPr>
           <w:rFonts w:ascii="Times New Roman" w:hAnsi="Times New Roman" w:cs="Times New Roman"/>
@@ -1415,11 +1420,12 @@
         </w:rPr>
         <w:t>UML</w:t>
       </w:r>
-      <w:bookmarkEnd w:id="2"/>
+      <w:bookmarkEnd w:id="3"/>
     </w:p>
     <w:p>
       <w:pPr>
         <w:spacing w:line="360" w:lineRule="auto"/>
+        <w:ind w:left="1440"/>
         <w:jc w:val="both"/>
         <w:rPr>
           <w:rFonts w:ascii="Times New Roman" w:hAnsi="Times New Roman" w:cs="Times New Roman"/>
@@ -1449,6 +1455,7 @@
     <w:p>
       <w:pPr>
         <w:spacing w:line="360" w:lineRule="auto"/>
+        <w:ind w:left="1440"/>
         <w:rPr>
           <w:rFonts w:ascii="Times New Roman" w:hAnsi="Times New Roman" w:cs="Times New Roman"/>
           <w:b/>
@@ -1471,6 +1478,7 @@
     <w:p>
       <w:pPr>
         <w:spacing w:line="360" w:lineRule="auto"/>
+        <w:ind w:left="1440"/>
         <w:rPr>
           <w:rFonts w:ascii="Times New Roman" w:hAnsi="Times New Roman" w:cs="Times New Roman"/>
           <w:b/>
@@ -1508,6 +1516,7 @@
     <w:p>
       <w:pPr>
         <w:spacing w:line="360" w:lineRule="auto"/>
+        <w:ind w:left="1440"/>
         <w:rPr>
           <w:rFonts w:ascii="Times New Roman" w:hAnsi="Times New Roman" w:cs="Times New Roman"/>
         </w:rPr>
@@ -1530,6 +1539,7 @@
     <w:p>
       <w:pPr>
         <w:spacing w:line="360" w:lineRule="auto"/>
+        <w:ind w:left="1440"/>
         <w:rPr>
           <w:rFonts w:ascii="Times New Roman" w:hAnsi="Times New Roman" w:cs="Times New Roman"/>
         </w:rPr>
@@ -1552,6 +1562,7 @@
     <w:p>
       <w:pPr>
         <w:spacing w:line="360" w:lineRule="auto"/>
+        <w:ind w:left="1440"/>
         <w:rPr>
           <w:bCs/>
         </w:rPr>
@@ -1671,7 +1682,7 @@
           <w:sz w:val="22"/>
         </w:rPr>
       </w:pPr>
-      <w:bookmarkStart w:id="3" w:name="_Toc236216656"/>
+      <w:bookmarkStart w:id="4" w:name="_Toc236216656"/>
       <w:r>
         <w:rPr>
           <w:rStyle w:val="Heading3Char"/>
@@ -1680,7 +1691,7 @@
         <w:lastRenderedPageBreak/>
         <w:t>FIG 1</w:t>
       </w:r>
-      <w:bookmarkEnd w:id="3"/>
+      <w:bookmarkEnd w:id="4"/>
       <w:r>
         <w:rPr>
           <w:b/>
@@ -1740,7 +1751,7 @@
             <v:path o:extrusionok="f" gradientshapeok="t" o:connecttype="rect"/>
             <o:lock v:ext="edit" aspectratio="t"/>
           </v:shapetype>
-          <v:shape id="_x0000_i1025" type="#_x0000_t75" style="width:608.55pt;height:327.45pt">
+          <v:shape id="_x0000_i1025" type="#_x0000_t75" style="width:609pt;height:327.75pt">
             <v:imagedata r:id="rId11" o:title="Screenshot 2026-07-20 132335"/>
           </v:shape>
         </w:pict>
@@ -1754,7 +1765,7 @@
           <w:sz w:val="22"/>
         </w:rPr>
       </w:pPr>
-      <w:bookmarkStart w:id="4" w:name="_Toc236216657"/>
+      <w:bookmarkStart w:id="5" w:name="_Toc236216657"/>
       <w:r>
         <w:rPr>
           <w:rStyle w:val="Heading3Char"/>
@@ -1762,7 +1773,7 @@
         </w:rPr>
         <w:t>FIG 2</w:t>
       </w:r>
-      <w:bookmarkEnd w:id="4"/>
+      <w:bookmarkEnd w:id="5"/>
       <w:r>
         <w:rPr>
           <w:b/>
@@ -1861,7 +1872,7 @@
           <w:sz w:val="22"/>
         </w:rPr>
       </w:pPr>
-      <w:bookmarkStart w:id="5" w:name="_Toc236216658"/>
+      <w:bookmarkStart w:id="6" w:name="_Toc236216658"/>
       <w:r>
         <w:rPr>
           <w:rStyle w:val="Heading3Char"/>
@@ -1869,7 +1880,7 @@
         </w:rPr>
         <w:t>FIG 3</w:t>
       </w:r>
-      <w:bookmarkEnd w:id="5"/>
+      <w:bookmarkEnd w:id="6"/>
       <w:r>
         <w:rPr>
           <w:b/>
@@ -1980,7 +1991,7 @@
           <w:sz w:val="22"/>
         </w:rPr>
       </w:pPr>
-      <w:bookmarkStart w:id="6" w:name="_Toc236216659"/>
+      <w:bookmarkStart w:id="7" w:name="_Toc236216659"/>
       <w:r>
         <w:rPr>
           <w:rStyle w:val="Heading3Char"/>
@@ -1988,7 +1999,7 @@
         </w:rPr>
         <w:t>FIG 4</w:t>
       </w:r>
-      <w:bookmarkEnd w:id="6"/>
+      <w:bookmarkEnd w:id="7"/>
       <w:r>
         <w:rPr>
           <w:b/>
@@ -2088,7 +2099,7 @@
           <w:sz w:val="22"/>
         </w:rPr>
       </w:pPr>
-      <w:bookmarkStart w:id="7" w:name="_Toc236216660"/>
+      <w:bookmarkStart w:id="8" w:name="_Toc236216660"/>
       <w:r>
         <w:rPr>
           <w:rStyle w:val="Heading3Char"/>
@@ -2096,7 +2107,7 @@
         </w:rPr>
         <w:t>FIG 5</w:t>
       </w:r>
-      <w:bookmarkEnd w:id="7"/>
+      <w:bookmarkEnd w:id="8"/>
       <w:r>
         <w:rPr>
           <w:b/>
@@ -2175,7 +2186,7 @@
           <w:szCs w:val="24"/>
         </w:rPr>
       </w:pPr>
-      <w:bookmarkStart w:id="8" w:name="_Toc236216661"/>
+      <w:bookmarkStart w:id="9" w:name="_Toc236216661"/>
       <w:proofErr w:type="gramStart"/>
       <w:r>
         <w:rPr>
@@ -2185,7 +2196,7 @@
         </w:rPr>
         <w:t>Class Diagram:</w:t>
       </w:r>
-      <w:bookmarkEnd w:id="8"/>
+      <w:bookmarkEnd w:id="9"/>
       <w:r>
         <w:rPr>
           <w:rFonts w:eastAsia="Times New Roman"/>
@@ -2283,11 +2294,11 @@
       <w:pPr>
         <w:pStyle w:val="Heading2"/>
       </w:pPr>
-      <w:bookmarkStart w:id="9" w:name="_Toc236216662"/>
+      <w:bookmarkStart w:id="10" w:name="_Toc236216662"/>
       <w:r>
         <w:t>ERD Explanation</w:t>
       </w:r>
-      <w:bookmarkEnd w:id="9"/>
+      <w:bookmarkEnd w:id="10"/>
     </w:p>
     <w:p>
       <w:pPr>
@@ -2702,6 +2713,7 @@
     <w:p>
       <w:pPr>
         <w:spacing w:line="360" w:lineRule="auto"/>
+        <w:ind w:left="360"/>
         <w:rPr>
           <w:rFonts w:ascii="Times New Roman" w:hAnsi="Times New Roman" w:cs="Times New Roman"/>
           <w:b/>
@@ -2709,15 +2721,22 @@
           <w:szCs w:val="24"/>
         </w:rPr>
       </w:pPr>
-      <w:bookmarkStart w:id="10" w:name="_Toc236216663"/>
+      <w:bookmarkStart w:id="11" w:name="_Toc236216663"/>
       <w:r>
         <w:rPr>
           <w:rStyle w:val="Heading3Char"/>
           <w:sz w:val="24"/>
         </w:rPr>
+        <w:t xml:space="preserve">1.2 </w:t>
+      </w:r>
+      <w:r>
+        <w:rPr>
+          <w:rStyle w:val="Heading3Char"/>
+          <w:sz w:val="24"/>
+        </w:rPr>
         <w:t>HTML</w:t>
       </w:r>
-      <w:bookmarkEnd w:id="10"/>
+      <w:bookmarkEnd w:id="11"/>
       <w:r>
         <w:rPr>
           <w:rFonts w:ascii="Times New Roman" w:hAnsi="Times New Roman" w:cs="Times New Roman"/>
@@ -2779,8 +2798,16 @@
           <w:sz w:val="24"/>
           <w:szCs w:val="24"/>
         </w:rPr>
+        <w:t xml:space="preserve">    </w:t>
+      </w:r>
+      <w:r>
+        <w:rPr>
+          <w:b/>
+          <w:sz w:val="24"/>
+          <w:szCs w:val="24"/>
+        </w:rPr>
         <w:pict>
-          <v:shape id="_x0000_i1026" type="#_x0000_t75" style="width:78pt;height:78pt">
+          <v:shape id="_x0000_i1026" type="#_x0000_t75" style="width:102.75pt;height:78pt">
             <v:imagedata r:id="rId16" o:title="images"/>
           </v:shape>
         </w:pict>
@@ -2789,16 +2816,24 @@
     <w:p>
       <w:pPr>
         <w:spacing w:line="360" w:lineRule="auto"/>
-      </w:pPr>
-      <w:bookmarkStart w:id="11" w:name="_Toc236216664"/>
+        <w:ind w:firstLine="720"/>
+      </w:pPr>
+      <w:bookmarkStart w:id="12" w:name="_Toc236216664"/>
       <w:r>
         <w:rPr>
           <w:rStyle w:val="Heading3Char"/>
           <w:sz w:val="24"/>
         </w:rPr>
+        <w:t xml:space="preserve">1.3 </w:t>
+      </w:r>
+      <w:r>
+        <w:rPr>
+          <w:rStyle w:val="Heading3Char"/>
+          <w:sz w:val="24"/>
+        </w:rPr>
         <w:t>CSS</w:t>
       </w:r>
-      <w:bookmarkEnd w:id="11"/>
+      <w:bookmarkEnd w:id="12"/>
       <w:r>
         <w:rPr>
           <w:rFonts w:ascii="Times New Roman" w:hAnsi="Times New Roman" w:cs="Times New Roman"/>
@@ -2837,16 +2872,24 @@
           <w:szCs w:val="24"/>
         </w:rPr>
       </w:pPr>
+      <w:r>
+        <w:rPr>
+          <w:b/>
+          <w:sz w:val="24"/>
+          <w:szCs w:val="24"/>
+        </w:rPr>
+        <w:lastRenderedPageBreak/>
+        <w:t xml:space="preserve">  </w:t>
+      </w:r>
       <w:r>
         <w:rPr>
           <w:b/>
           <w:noProof/>
         </w:rPr>
-        <w:lastRenderedPageBreak/>
         <w:drawing>
           <wp:inline distT="0" distB="0" distL="0" distR="0" wp14:anchorId="0B3EB18A" wp14:editId="7F2DB965">
-            <wp:extent cx="931333" cy="931333"/>
-            <wp:effectExtent l="0" t="0" r="2540" b="2540"/>
+            <wp:extent cx="1317171" cy="936170"/>
+            <wp:effectExtent l="0" t="0" r="0" b="0"/>
             <wp:docPr id="16" name="Picture 16" descr="C:\Users\Brandon\AppData\Local\Microsoft\Windows\INetCache\Content.Word\images (1).png"/>
             <wp:cNvGraphicFramePr>
               <a:graphicFrameLocks xmlns:a="http://schemas.openxmlformats.org/drawingml/2006/main" noChangeAspect="1"/>
@@ -2876,7 +2919,7 @@
                   <pic:spPr bwMode="auto">
                     <a:xfrm>
                       <a:off x="0" y="0"/>
-                      <a:ext cx="931333" cy="931333"/>
+                      <a:ext cx="1310365" cy="931333"/>
                     </a:xfrm>
                     <a:prstGeom prst="rect">
                       <a:avLst/>
@@ -2896,6 +2939,7 @@
     <w:p>
       <w:pPr>
         <w:spacing w:line="360" w:lineRule="auto"/>
+        <w:ind w:left="720"/>
         <w:rPr>
           <w:rFonts w:ascii="Times New Roman" w:hAnsi="Times New Roman" w:cs="Times New Roman"/>
           <w:b/>
@@ -2903,15 +2947,22 @@
           <w:szCs w:val="24"/>
         </w:rPr>
       </w:pPr>
-      <w:bookmarkStart w:id="12" w:name="_Toc236216665"/>
+      <w:bookmarkStart w:id="13" w:name="_Toc236216665"/>
       <w:r>
         <w:rPr>
           <w:rStyle w:val="Heading3Char"/>
           <w:sz w:val="24"/>
         </w:rPr>
+        <w:t xml:space="preserve">1.4 </w:t>
+      </w:r>
+      <w:r>
+        <w:rPr>
+          <w:rStyle w:val="Heading3Char"/>
+          <w:sz w:val="24"/>
+        </w:rPr>
         <w:t>JavaScript</w:t>
       </w:r>
-      <w:bookmarkEnd w:id="12"/>
+      <w:bookmarkEnd w:id="13"/>
       <w:r>
         <w:rPr>
           <w:sz w:val="24"/>
@@ -2947,8 +2998,14 @@
         <w:rPr>
           <w:szCs w:val="24"/>
         </w:rPr>
+        <w:t xml:space="preserve">         </w:t>
+      </w:r>
+      <w:r>
+        <w:rPr>
+          <w:szCs w:val="24"/>
+        </w:rPr>
         <w:pict>
-          <v:shape id="_x0000_i1027" type="#_x0000_t75" style="width:74.55pt;height:74.55pt">
+          <v:shape id="_x0000_i1027" type="#_x0000_t75" style="width:74.25pt;height:74.25pt">
             <v:imagedata r:id="rId18" o:title="images (2)"/>
           </v:shape>
         </w:pict>
@@ -2985,12 +3042,20 @@
     <w:p>
       <w:pPr>
         <w:spacing w:line="360" w:lineRule="auto"/>
+        <w:ind w:left="720"/>
         <w:rPr>
           <w:sz w:val="24"/>
           <w:szCs w:val="24"/>
         </w:rPr>
       </w:pPr>
-      <w:bookmarkStart w:id="13" w:name="_Toc236216666"/>
+      <w:bookmarkStart w:id="14" w:name="_Toc236216666"/>
+      <w:r>
+        <w:rPr>
+          <w:rStyle w:val="Heading3Char"/>
+          <w:sz w:val="24"/>
+        </w:rPr>
+        <w:t xml:space="preserve">1.5 </w:t>
+      </w:r>
       <w:proofErr w:type="spellStart"/>
       <w:r>
         <w:rPr>
@@ -2999,7 +3064,7 @@
         </w:rPr>
         <w:t>IndexedDB</w:t>
       </w:r>
-      <w:bookmarkEnd w:id="13"/>
+      <w:bookmarkEnd w:id="14"/>
       <w:proofErr w:type="spellEnd"/>
       <w:r>
         <w:rPr>
@@ -3028,24 +3093,14 @@
           <w:szCs w:val="24"/>
         </w:rPr>
       </w:pPr>
-    </w:p>
-    <w:p>
-      <w:pPr>
-        <w:spacing w:line="360" w:lineRule="auto"/>
+      <w:r>
         <w:rPr>
           <w:b/>
           <w:sz w:val="24"/>
           <w:szCs w:val="24"/>
         </w:rPr>
-      </w:pPr>
-      <w:r>
-        <w:rPr>
-          <w:b/>
-          <w:sz w:val="24"/>
-          <w:szCs w:val="24"/>
-        </w:rPr>
         <w:pict>
-          <v:shape id="_x0000_i1029" type="#_x0000_t75" style="width:122.55pt;height:98.55pt">
+          <v:shape id="_x0000_i1029" type="#_x0000_t75" style="width:122.25pt;height:99pt">
             <v:imagedata r:id="rId19" o:title="images (3)"/>
           </v:shape>
         </w:pict>
@@ -3054,11 +3109,18 @@
     <w:p>
       <w:pPr>
         <w:pStyle w:val="Heading3"/>
-        <w:rPr>
-          <w:sz w:val="24"/>
-        </w:rPr>
-      </w:pPr>
-      <w:bookmarkStart w:id="14" w:name="_Toc236216667"/>
+        <w:ind w:firstLine="720"/>
+        <w:rPr>
+          <w:sz w:val="24"/>
+        </w:rPr>
+      </w:pPr>
+      <w:bookmarkStart w:id="15" w:name="_Toc236216667"/>
+      <w:r>
+        <w:rPr>
+          <w:sz w:val="24"/>
+        </w:rPr>
+        <w:t xml:space="preserve">1.6 </w:t>
+      </w:r>
       <w:r>
         <w:rPr>
           <w:sz w:val="24"/>
@@ -3071,10 +3133,11 @@
         </w:rPr>
         <w:t>:</w:t>
       </w:r>
-      <w:bookmarkEnd w:id="14"/>
-    </w:p>
-    <w:p>
-      <w:pPr>
+      <w:bookmarkEnd w:id="15"/>
+    </w:p>
+    <w:p>
+      <w:pPr>
+        <w:ind w:firstLine="720"/>
         <w:rPr>
           <w:rFonts w:ascii="Times New Roman" w:hAnsi="Times New Roman" w:cs="Times New Roman"/>
         </w:rPr>
@@ -3101,13 +3164,16 @@
       </w:r>
     </w:p>
     <w:p>
+      <w:r>
+        <w:t xml:space="preserve">       </w:t>
+      </w:r>
       <w:r>
         <w:rPr>
           <w:noProof/>
         </w:rPr>
         <w:drawing>
           <wp:inline distT="0" distB="0" distL="0" distR="0">
-            <wp:extent cx="1589314" cy="794657"/>
+            <wp:extent cx="1247774" cy="790575"/>
             <wp:effectExtent l="0" t="0" r="0" b="0"/>
             <wp:docPr id="2" name="Picture 2" descr="The Pros and Cons of Different Testing Tools - JIRA"/>
             <wp:cNvGraphicFramePr>
@@ -3138,7 +3204,7 @@
                   <pic:spPr bwMode="auto">
                     <a:xfrm>
                       <a:off x="0" y="0"/>
-                      <a:ext cx="1591879" cy="795940"/>
+                      <a:ext cx="1256242" cy="795940"/>
                     </a:xfrm>
                     <a:prstGeom prst="rect">
                       <a:avLst/>
@@ -3161,11 +3227,11 @@
         <w:pStyle w:val="Heading1"/>
         <w:spacing w:line="360" w:lineRule="auto"/>
       </w:pPr>
-      <w:bookmarkStart w:id="15" w:name="_Toc236216668"/>
+      <w:bookmarkStart w:id="16" w:name="_Toc236216668"/>
       <w:r>
         <w:t>Appendices</w:t>
       </w:r>
-      <w:bookmarkEnd w:id="15"/>
+      <w:bookmarkEnd w:id="16"/>
       <w:r>
         <w:t>:</w:t>
       </w:r>
@@ -3177,8 +3243,6 @@
           <w:rFonts w:ascii="Times New Roman" w:hAnsi="Times New Roman" w:cs="Times New Roman"/>
         </w:rPr>
       </w:pPr>
-      <w:bookmarkStart w:id="16" w:name="_GoBack"/>
-      <w:bookmarkEnd w:id="16"/>
       <w:r>
         <w:rPr>
           <w:rFonts w:ascii="Times New Roman" w:hAnsi="Times New Roman" w:cs="Times New Roman"/>
@@ -8223,7 +8287,7 @@
 </file>
 
 <file path=customXml/itemProps1.xml><?xml version="1.0" encoding="utf-8"?>
-<ds:datastoreItem xmlns:ds="http://schemas.openxmlformats.org/officeDocument/2006/customXml" ds:itemID="{F5F79CC8-B88E-43B8-B8D0-C07BBC005253}">
+<ds:datastoreItem xmlns:ds="http://schemas.openxmlformats.org/officeDocument/2006/customXml" ds:itemID="{FF62A95D-B3CC-4DDB-9C42-B0AF09AC5D15}">
   <ds:schemaRefs>
     <ds:schemaRef ds:uri="http://schemas.openxmlformats.org/officeDocument/2006/bibliography"/>
   </ds:schemaRefs>

</xml_diff>